<commit_message>
feat: complete legal strategy report for Liao Kuang-Hui and Chan Ming-Hui case
</commit_message>
<xml_diff>
--- a/3.住/legal_strategy_report.docx
+++ b/3.住/legal_strategy_report.docx
@@ -4,13 +4,6 @@
   <w:body>
     <w:p>
       <w:pPr>
-        <w:spacing w:before="400" w:after="200"/>
-        <w:jc w:val="center"/>
-      </w:pPr>
-    </w:p>
-    <w:p>
-      <w:pPr>
-        <w:spacing w:after="300"/>
         <w:jc w:val="center"/>
       </w:pPr>
       <w:r>
@@ -50,7 +43,7 @@
     </w:p>
     <w:p>
       <w:pPr>
-        <w:spacing w:before="200" w:after="120"/>
+        <w:spacing w:before="200" w:after="80"/>
         <w:jc w:val="center"/>
       </w:pPr>
       <w:r>
@@ -58,14 +51,14 @@
           <w:rFonts w:ascii="PingFang TC" w:hAnsi="PingFang TC"/>
           <w:b/>
           <w:color w:val="DE5814"/>
-          <w:sz w:val="44"/>
+          <w:sz w:val="42"/>
         </w:rPr>
-        <w:t>八旬失智配偶法律權益保全與離婚訴訟戰略報告</w:t>
+        <w:t>八旬失智配偶法律防禦與權益最大化戰略報告書</w:t>
       </w:r>
     </w:p>
     <w:p>
       <w:pPr>
-        <w:spacing w:after="400"/>
+        <w:spacing w:after="280"/>
         <w:jc w:val="center"/>
       </w:pPr>
       <w:r>
@@ -73,20 +66,19 @@
           <w:rFonts w:ascii="PingFang TC" w:hAnsi="PingFang TC"/>
           <w:b/>
           <w:color w:val="A83212"/>
-          <w:sz w:val="24"/>
+          <w:sz w:val="22"/>
         </w:rPr>
-        <w:t>阻斷惡意脫產・夫妻剩餘財產清算・監護宣告・追討第三者・權益最大化全指南</w:t>
+        <w:t>阻斷廖光輝惡意脫產・向第三者湛明輝追討資產・監護宣告・夫妻剩餘財產清算全攻略</w:t>
       </w:r>
     </w:p>
     <w:p>
       <w:pPr>
-        <w:spacing w:after="500"/>
         <w:jc w:val="center"/>
       </w:pPr>
       <w:r>
         <w:drawing>
           <wp:inline xmlns:a="http://schemas.openxmlformats.org/drawingml/2006/main" xmlns:pic="http://schemas.openxmlformats.org/drawingml/2006/picture">
-            <wp:extent cx="4754880" cy="147930"/>
+            <wp:extent cx="4572000" cy="142240"/>
             <wp:docPr id="2" name="Picture 2"/>
             <wp:cNvGraphicFramePr>
               <a:graphicFrameLocks noChangeAspect="1"/>
@@ -107,7 +99,7 @@
                   <pic:spPr>
                     <a:xfrm>
                       <a:off x="0" y="0"/>
-                      <a:ext cx="4754880" cy="147930"/>
+                      <a:ext cx="4572000" cy="142240"/>
                     </a:xfrm>
                     <a:prstGeom prst="rect"/>
                   </pic:spPr>
@@ -133,10 +125,10 @@
             <w:tcW w:type="dxa" w:w="9412"/>
             <w:shd w:fill="FFFBEB"/>
             <w:tcMar>
-              <w:top w:w="180" w:type="dxa"/>
-              <w:bottom w:w="180" w:type="dxa"/>
-              <w:left w:w="300" w:type="dxa"/>
-              <w:right w:w="300" w:type="dxa"/>
+              <w:top w:w="160" w:type="dxa"/>
+              <w:bottom w:w="160" w:type="dxa"/>
+              <w:left w:w="260" w:type="dxa"/>
+              <w:right w:w="260" w:type="dxa"/>
             </w:tcMar>
           </w:tcPr>
           <w:p>
@@ -159,7 +151,7 @@
                 <w:color w:val="2D3748"/>
                 <w:sz w:val="20"/>
               </w:rPr>
-              <w:t>家事法規與權益實務戰略專案 ｜ 日期：2026年9月</w:t>
+              <w:t>台灣家事法規實務與財產保全專案 ｜ 日期：2026年9月</w:t>
             </w:r>
           </w:p>
         </w:tc>
@@ -181,7 +173,7 @@
           <w:color w:val="DE5814"/>
           <w:sz w:val="32"/>
         </w:rPr>
-        <w:t>第一章：醫療端關鍵診斷證明開立指引（台中榮總就醫）</w:t>
+        <w:t>壹、【說明篇】本案法律本質與核心戰略形勢分析</w:t>
       </w:r>
     </w:p>
     <w:p>
@@ -195,7 +187,25 @@
           <w:color w:val="2D3748"/>
           <w:sz w:val="21"/>
         </w:rPr>
-        <w:t>針對母親罹患腦部退化（失智症），且目前已具備申請外籍看護資格之現況，前往台中榮總神經內科由其他主治醫師接替看診時，必須同步辦妥以下兩大法律與福利證明：</w:t>
+        <w:t>本案當事人雙方均為</w:t>
+      </w:r>
+      <w:r>
+        <w:rPr>
+          <w:rFonts w:ascii="PingFang TC" w:hAnsi="PingFang TC"/>
+          <w:b/>
+          <w:color w:val="D97706"/>
+          <w:sz w:val="21"/>
+        </w:rPr>
+        <w:t>民國三十八年次（現年約77歲）</w:t>
+      </w:r>
+      <w:r>
+        <w:rPr>
+          <w:rFonts w:ascii="PingFang TC" w:hAnsi="PingFang TC"/>
+          <w:b w:val="0"/>
+          <w:color w:val="2D3748"/>
+          <w:sz w:val="21"/>
+        </w:rPr>
+        <w:t>，結縭近五十年（金婚）。母親長年相夫教子，晚年罹患腦神經退化（失智重症），日常生活已達需專人照顧且符合外籍看護聘僱資格；父親廖光輝身為有責配偶，不思扶養照料，竟在外與第三者湛明輝交往，甚至將名下不動產與巨額存款惡意移轉登記予湛明輝，企圖透過訴訟拋棄病妻。</w:t>
       </w:r>
     </w:p>
     <w:p>
@@ -209,7 +219,99 @@
           <w:color w:val="A83212"/>
           <w:sz w:val="26"/>
         </w:rPr>
-        <w:t>1.1 申辦【身心障礙證明（殘障手冊）】（看診前先備表）</w:t>
+        <w:t>1.1 婚齡近半世紀：法官心證「絕對不准父親判決離婚」</w:t>
+      </w:r>
+    </w:p>
+    <w:p>
+      <w:pPr>
+        <w:spacing w:before="40" w:after="80" w:line="300" w:lineRule="auto"/>
+      </w:pPr>
+      <w:r>
+        <w:rPr>
+          <w:rFonts w:ascii="PingFang TC" w:hAnsi="PingFang TC"/>
+          <w:b w:val="0"/>
+          <w:color w:val="2D3748"/>
+          <w:sz w:val="21"/>
+        </w:rPr>
+        <w:t>依《民法》第 1052 條第 2 項但書規定：「難以維持婚姻之重大事由應由夫妻之一方負責者，僅他方得請求離婚。」廖光輝外遇出軌且惡意脫產，為破壞婚姻之唯一過失方；母親失智為重大疾病，非其過錯。在司法裁判實務上，法官極度排斥「另一半重病就惡意丟包」之脫法訴求，若由監護人代理母親堅決不同意離婚，</w:t>
+      </w:r>
+      <w:r>
+        <w:rPr>
+          <w:rFonts w:ascii="PingFang TC" w:hAnsi="PingFang TC"/>
+          <w:b/>
+          <w:color w:val="D97706"/>
+          <w:sz w:val="21"/>
+        </w:rPr>
+        <w:t>法官有 99% 以上機率直接駁回廖光輝的離婚起訴</w:t>
+      </w:r>
+      <w:r>
+        <w:rPr>
+          <w:rFonts w:ascii="PingFang TC" w:hAnsi="PingFang TC"/>
+          <w:b w:val="0"/>
+          <w:color w:val="2D3748"/>
+          <w:sz w:val="21"/>
+        </w:rPr>
+        <w:t>！</w:t>
+      </w:r>
+    </w:p>
+    <w:p>
+      <w:pPr>
+        <w:spacing w:before="200" w:after="80"/>
+      </w:pPr>
+      <w:r>
+        <w:rPr>
+          <w:rFonts w:ascii="PingFang TC" w:hAnsi="PingFang TC"/>
+          <w:b/>
+          <w:color w:val="A83212"/>
+          <w:sz w:val="26"/>
+        </w:rPr>
+        <w:t>1.2 財產黃金期：100% 均落在「應平分的婚後財產」</w:t>
+      </w:r>
+    </w:p>
+    <w:p>
+      <w:pPr>
+        <w:spacing w:before="40" w:after="80" w:line="300" w:lineRule="auto"/>
+      </w:pPr>
+      <w:r>
+        <w:rPr>
+          <w:rFonts w:ascii="PingFang TC" w:hAnsi="PingFang TC"/>
+          <w:b w:val="0"/>
+          <w:color w:val="2D3748"/>
+          <w:sz w:val="21"/>
+        </w:rPr>
+        <w:t>長輩一輩子置產累積財富均在民國 74 年民法修正後之婚姻存續期間。廖光輝名下無論房地產、股票或銀行存款，依法全數推定為「婚後財產」，完全無法扣除，</w:t>
+      </w:r>
+      <w:r>
+        <w:rPr>
+          <w:rFonts w:ascii="PingFang TC" w:hAnsi="PingFang TC"/>
+          <w:b/>
+          <w:color w:val="D97706"/>
+          <w:sz w:val="21"/>
+        </w:rPr>
+        <w:t>母親依法穩穩享有剩餘財產淨額 50% 請求權</w:t>
+      </w:r>
+      <w:r>
+        <w:rPr>
+          <w:rFonts w:ascii="PingFang TC" w:hAnsi="PingFang TC"/>
+          <w:b w:val="0"/>
+          <w:color w:val="2D3748"/>
+          <w:sz w:val="21"/>
+        </w:rPr>
+        <w:t>！</w:t>
+      </w:r>
+    </w:p>
+    <w:p>
+      <w:pPr>
+        <w:spacing w:before="200" w:after="80"/>
+      </w:pPr>
+      <w:r>
+        <w:rPr>
+          <w:rFonts w:ascii="PingFang TC" w:hAnsi="PingFang TC"/>
+          <w:b/>
+          <w:color w:val="A83212"/>
+          <w:sz w:val="26"/>
+        </w:rPr>
+        <w:t>1.3 核心戰略博弈：「離」與「不離」的極限抉擇</w:t>
       </w:r>
     </w:p>
     <w:p>
@@ -232,7 +334,7 @@
           <w:color w:val="D97706"/>
           <w:sz w:val="21"/>
         </w:rPr>
-        <w:t>辦理程序：</w:t>
+        <w:t>策略 A：堅決不離（以拖待變・保全最大遺產）【首選】</w:t>
       </w:r>
       <w:r>
         <w:rPr>
@@ -241,7 +343,7 @@
           <w:color w:val="2D3748"/>
           <w:sz w:val="21"/>
         </w:rPr>
-        <w:t>身心障礙證明依法由地方政府社會局核發，醫院負責醫療鑑定。為避免多跑一趟，家屬請於看診前攜帶母親身分證正本、印章、1吋照片3張及代辦人證件，至戶籍地區公所社會課領取空白的「身心障礙者鑑定表」。</w:t>
+        <w:t>：母親保留合法配偶第一順位繼承權。廖光輝百年之時，母親先切走剩餘財產一半，剩下遺產再與子女均分；小三湛明輝在法律上為完全局外人，一毛遺產都分不到！</w:t>
       </w:r>
     </w:p>
     <w:p>
@@ -264,7 +366,7 @@
           <w:color w:val="D97706"/>
           <w:sz w:val="21"/>
         </w:rPr>
-        <w:t>診間落實：</w:t>
+        <w:t>策略 B：反訴離婚（即刻落袋・強制清算）【防脫產】</w:t>
       </w:r>
       <w:r>
         <w:rPr>
@@ -273,7 +375,35 @@
           <w:color w:val="2D3748"/>
           <w:sz w:val="21"/>
         </w:rPr>
-        <w:t>看診當天直接將鑑定表交由看診醫師。醫師調閱台中榮總歷史病歷與腦部影像即可完成第一階段生理評估，院內身心障礙鑑定窗口（第一醫療大樓一樓大廳）將於當日或7日內接續完成生活功能評估，並由醫院專函送交衛生局審查發證。</w:t>
+        <w:t>：若發現廖光輝正急速將資產洗給湛明輝，立即發動反訴，全面假扣押查封資產，強迫湛明輝吐出差額，即刻將數千萬產權與存款過戶至母親名下設立安養信託。</w:t>
+      </w:r>
+    </w:p>
+    <w:p>
+      <w:pPr>
+        <w:spacing w:before="280" w:after="80"/>
+      </w:pPr>
+      <w:r>
+        <w:rPr>
+          <w:rFonts w:ascii="PingFang TC" w:hAnsi="PingFang TC"/>
+          <w:b/>
+          <w:color w:val="DE5814"/>
+          <w:sz w:val="32"/>
+        </w:rPr>
+        <w:t>貳、【程序篇】法院訴訟與財產保全三大法定程序</w:t>
+      </w:r>
+    </w:p>
+    <w:p>
+      <w:pPr>
+        <w:spacing w:before="200" w:after="80"/>
+      </w:pPr>
+      <w:r>
+        <w:rPr>
+          <w:rFonts w:ascii="PingFang TC" w:hAnsi="PingFang TC"/>
+          <w:b/>
+          <w:color w:val="A83212"/>
+          <w:sz w:val="26"/>
+        </w:rPr>
+        <w:t>2.1 家事法院【監護宣告程序】（民法第 14 條）</w:t>
       </w:r>
     </w:p>
     <w:p>
@@ -287,7 +417,7 @@
           <w:color w:val="2D3748"/>
           <w:sz w:val="21"/>
         </w:rPr>
-        <w:t xml:space="preserve">• </w:t>
+        <w:t>母親因進行性神經退化已無意思辨識能力，由子女向法院聲請監護宣告，指定子女為法定監護人兼法定代理人。此程序能</w:t>
       </w:r>
       <w:r>
         <w:rPr>
@@ -296,7 +426,7 @@
           <w:color w:val="D97706"/>
           <w:sz w:val="21"/>
         </w:rPr>
-        <w:t>實質效益：</w:t>
+        <w:t>徹底阻斷廖光輝私下誘騙母親簽署離婚協議書或拋棄財產切結書</w:t>
       </w:r>
       <w:r>
         <w:rPr>
@@ -305,7 +435,7 @@
           <w:color w:val="2D3748"/>
           <w:sz w:val="21"/>
         </w:rPr>
-        <w:t>每年享綜合所得稅特別扣除額21.8萬元、健保自付額減免（中度減半、重度全免）、牌照稅減免，且取得重度以上證明可直接享有免繳聘僱外籍看護每月2,000元就業安定費之實質經濟優惠。</w:t>
+        <w:t>，且母親私簽之任何文件在法律上一律自始無效；未來所有法庭攻防均由監護人代表出席。</w:t>
       </w:r>
     </w:p>
     <w:p>
@@ -319,7 +449,7 @@
           <w:color w:val="A83212"/>
           <w:sz w:val="26"/>
         </w:rPr>
-        <w:t>1.2 開立訴訟防禦專用【乙種診斷證明書】</w:t>
+        <w:t>2.2 防範洗錢脫產：法院【假扣押保全程序】與【暫時處分】</w:t>
       </w:r>
     </w:p>
     <w:p>
@@ -333,7 +463,49 @@
           <w:color w:val="2D3748"/>
           <w:sz w:val="21"/>
         </w:rPr>
-        <w:t>向接診醫師申請診斷證明書時，務必請醫師在診斷與醫囑欄中載明以下四大關鍵法律要件，作為法庭上無可辯駁之鐵證：</w:t>
+        <w:t>為防止湛明輝將到手的房地產緊急轉售給不知情善意第三人，律師應立即向法院聲請「假扣押裁定」，全面查封廖光輝與湛明輝名下不動產與銀行帳戶；同步依民法第1116-1條聲請暫時處分，命廖光輝於判決前按月支付外籍看護薪資與生活醫療費。</w:t>
+      </w:r>
+    </w:p>
+    <w:p>
+      <w:pPr>
+        <w:spacing w:before="200" w:after="80"/>
+      </w:pPr>
+      <w:r>
+        <w:rPr>
+          <w:rFonts w:ascii="PingFang TC" w:hAnsi="PingFang TC"/>
+          <w:b/>
+          <w:color w:val="A83212"/>
+          <w:sz w:val="26"/>
+        </w:rPr>
+        <w:t>2.3 實體審判裁判程序：多管齊下反擊</w:t>
+      </w:r>
+    </w:p>
+    <w:p>
+      <w:pPr>
+        <w:spacing w:before="40" w:after="80" w:line="300" w:lineRule="auto"/>
+      </w:pPr>
+      <w:r>
+        <w:rPr>
+          <w:rFonts w:ascii="PingFang TC" w:hAnsi="PingFang TC"/>
+          <w:b w:val="0"/>
+          <w:color w:val="2D3748"/>
+          <w:sz w:val="21"/>
+        </w:rPr>
+        <w:t>在家事法庭開庭時，由監護人代表出庭，主張民法第1052條但書拒絕無理離婚；同步合併提起夫妻剩餘財產分配反訴、追討湛明輝追加資產、以及共同訴請侵害配偶權之損害賠償。</w:t>
+      </w:r>
+    </w:p>
+    <w:p>
+      <w:pPr>
+        <w:spacing w:before="280" w:after="80"/>
+      </w:pPr>
+      <w:r>
+        <w:rPr>
+          <w:rFonts w:ascii="PingFang TC" w:hAnsi="PingFang TC"/>
+          <w:b/>
+          <w:color w:val="DE5814"/>
+          <w:sz w:val="32"/>
+        </w:rPr>
+        <w:t>參、【方法篇】爭取權益與賠償金最大化的四大實體請求方法</w:t>
       </w:r>
     </w:p>
     <w:tbl>
@@ -343,19 +515,21 @@
         <w:tblLook w:firstColumn="1" w:firstRow="1" w:lastColumn="0" w:lastRow="0" w:noHBand="0" w:noVBand="1" w:val="04A0"/>
       </w:tblPr>
       <w:tblGrid>
-        <w:gridCol w:w="4706"/>
-        <w:gridCol w:w="4706"/>
+        <w:gridCol w:w="2353"/>
+        <w:gridCol w:w="2353"/>
+        <w:gridCol w:w="2353"/>
+        <w:gridCol w:w="2353"/>
       </w:tblGrid>
       <w:tr>
         <w:tc>
           <w:tcPr>
-            <w:tcW w:type="dxa" w:w="4706"/>
+            <w:tcW w:type="dxa" w:w="2353"/>
             <w:shd w:fill="FEF3C7"/>
             <w:tcMar>
               <w:top w:w="100" w:type="dxa"/>
               <w:bottom w:w="100" w:type="dxa"/>
-              <w:left w:w="140" w:type="dxa"/>
-              <w:right w:w="140" w:type="dxa"/>
+              <w:left w:w="120" w:type="dxa"/>
+              <w:right w:w="120" w:type="dxa"/>
             </w:tcMar>
           </w:tcPr>
           <w:p>
@@ -364,19 +538,19 @@
                 <w:b/>
                 <w:color w:val="A83212"/>
               </w:rPr>
-              <w:t>關鍵要素</w:t>
+              <w:t>求償方法項目</w:t>
             </w:r>
           </w:p>
         </w:tc>
         <w:tc>
           <w:tcPr>
-            <w:tcW w:type="dxa" w:w="4706"/>
+            <w:tcW w:type="dxa" w:w="2353"/>
             <w:shd w:fill="FEF3C7"/>
             <w:tcMar>
               <w:top w:w="100" w:type="dxa"/>
               <w:bottom w:w="100" w:type="dxa"/>
-              <w:left w:w="140" w:type="dxa"/>
-              <w:right w:w="140" w:type="dxa"/>
+              <w:left w:w="120" w:type="dxa"/>
+              <w:right w:w="120" w:type="dxa"/>
             </w:tcMar>
           </w:tcPr>
           <w:p>
@@ -385,19 +559,17 @@
                 <w:b/>
                 <w:color w:val="A83212"/>
               </w:rPr>
-              <w:t>具體文字與訴訟防禦效果</w:t>
+              <w:t>民法條文依據</w:t>
             </w:r>
           </w:p>
         </w:tc>
-      </w:tr>
-      <w:tr>
         <w:tc>
           <w:tcPr>
-            <w:tcW w:type="dxa" w:w="4706"/>
-            <w:shd w:fill="FFFFFF"/>
+            <w:tcW w:type="dxa" w:w="2353"/>
+            <w:shd w:fill="FEF3C7"/>
             <w:tcMar>
-              <w:top w:w="90" w:type="dxa"/>
-              <w:bottom w:w="90" w:type="dxa"/>
+              <w:top w:w="100" w:type="dxa"/>
+              <w:bottom w:w="100" w:type="dxa"/>
               <w:left w:w="120" w:type="dxa"/>
               <w:right w:w="120" w:type="dxa"/>
             </w:tcMar>
@@ -406,41 +578,19 @@
             <w:r>
               <w:rPr>
                 <w:b/>
-                <w:color w:val="D97706"/>
+                <w:color w:val="A83212"/>
               </w:rPr>
-              <w:t>精確病名與病程</w:t>
+              <w:t>具體求償方法與實務計算</w:t>
             </w:r>
           </w:p>
         </w:tc>
         <w:tc>
           <w:tcPr>
-            <w:tcW w:type="dxa" w:w="4706"/>
-            <w:shd w:fill="FFFFFF"/>
+            <w:tcW w:type="dxa" w:w="2353"/>
+            <w:shd w:fill="FEF3C7"/>
             <w:tcMar>
-              <w:top w:w="90" w:type="dxa"/>
-              <w:bottom w:w="90" w:type="dxa"/>
-              <w:left w:w="120" w:type="dxa"/>
-              <w:right w:w="120" w:type="dxa"/>
-            </w:tcMar>
-          </w:tcPr>
-          <w:p>
-            <w:r>
-              <w:rPr>
-                <w:color w:val="2D3748"/>
-              </w:rPr>
-              <w:t>載明失智症／腦退化學名，並註明「長期於台中榮總規則治療追蹤」，證實病況為不可逆之神經退化，非人為故意所致。</w:t>
-            </w:r>
-          </w:p>
-        </w:tc>
-      </w:tr>
-      <w:tr>
-        <w:tc>
-          <w:tcPr>
-            <w:tcW w:type="dxa" w:w="4706"/>
-            <w:shd w:fill="FFFDF7"/>
-            <w:tcMar>
-              <w:top w:w="90" w:type="dxa"/>
-              <w:bottom w:w="90" w:type="dxa"/>
+              <w:top w:w="100" w:type="dxa"/>
+              <w:bottom w:w="100" w:type="dxa"/>
               <w:left w:w="120" w:type="dxa"/>
               <w:right w:w="120" w:type="dxa"/>
             </w:tcMar>
@@ -449,29 +599,9 @@
             <w:r>
               <w:rPr>
                 <w:b/>
-                <w:color w:val="D97706"/>
+                <w:color w:val="A83212"/>
               </w:rPr>
-              <w:t>量表數據（CDR／MMSE）</w:t>
-            </w:r>
-          </w:p>
-        </w:tc>
-        <w:tc>
-          <w:tcPr>
-            <w:tcW w:type="dxa" w:w="4706"/>
-            <w:shd w:fill="FFFDF7"/>
-            <w:tcMar>
-              <w:top w:w="90" w:type="dxa"/>
-              <w:bottom w:w="90" w:type="dxa"/>
-              <w:left w:w="120" w:type="dxa"/>
-              <w:right w:w="120" w:type="dxa"/>
-            </w:tcMar>
-          </w:tcPr>
-          <w:p>
-            <w:r>
-              <w:rPr>
-                <w:color w:val="2D3748"/>
-              </w:rPr>
-              <w:t>明確註記 CDR（臨床失智評估量表）分數（如 CDR=1、2或3分）與 MMSE 分數，為外勞新制免評與法律能力之客觀標準。</w:t>
+              <w:t>預估效益與戰略定位</w:t>
             </w:r>
           </w:p>
         </w:tc>
@@ -479,42 +609,93 @@
       <w:tr>
         <w:tc>
           <w:tcPr>
-            <w:tcW w:type="dxa" w:w="4706"/>
+            <w:tcW w:type="dxa" w:w="2353"/>
             <w:shd w:fill="FFFFFF"/>
             <w:tcMar>
               <w:top w:w="90" w:type="dxa"/>
               <w:bottom w:w="90" w:type="dxa"/>
-              <w:left w:w="120" w:type="dxa"/>
-              <w:right w:w="120" w:type="dxa"/>
+              <w:left w:w="110" w:type="dxa"/>
+              <w:right w:w="110" w:type="dxa"/>
             </w:tcMar>
           </w:tcPr>
           <w:p>
             <w:r>
               <w:rPr>
+                <w:rFonts w:ascii="PingFang TC" w:hAnsi="PingFang TC"/>
                 <w:b/>
-                <w:color w:val="D97706"/>
+                <w:color w:val="DE5814"/>
+                <w:sz w:val="19"/>
               </w:rPr>
-              <w:t>喪失意思與辨識能力</w:t>
+              <w:t>一、夫妻剩餘財產分配請求權</w:t>
             </w:r>
           </w:p>
         </w:tc>
         <w:tc>
           <w:tcPr>
-            <w:tcW w:type="dxa" w:w="4706"/>
+            <w:tcW w:type="dxa" w:w="2353"/>
             <w:shd w:fill="FFFFFF"/>
             <w:tcMar>
               <w:top w:w="90" w:type="dxa"/>
               <w:bottom w:w="90" w:type="dxa"/>
-              <w:left w:w="120" w:type="dxa"/>
-              <w:right w:w="120" w:type="dxa"/>
+              <w:left w:w="110" w:type="dxa"/>
+              <w:right w:w="110" w:type="dxa"/>
             </w:tcMar>
           </w:tcPr>
           <w:p>
             <w:r>
               <w:rPr>
+                <w:rFonts w:ascii="PingFang TC" w:hAnsi="PingFang TC"/>
                 <w:color w:val="2D3748"/>
+                <w:sz w:val="19"/>
               </w:rPr>
-              <w:t>載明「認知功能嚴重減退，致不能辨識其行為或缺乏獨立處理自己事務之能力」。阻斷父親私下哄騙母親簽署離婚協議或財產過戶。</w:t>
+              <w:t>民法第 1030 條之 1</w:t>
+            </w:r>
+          </w:p>
+        </w:tc>
+        <w:tc>
+          <w:tcPr>
+            <w:tcW w:type="dxa" w:w="2353"/>
+            <w:shd w:fill="FFFFFF"/>
+            <w:tcMar>
+              <w:top w:w="90" w:type="dxa"/>
+              <w:bottom w:w="90" w:type="dxa"/>
+              <w:left w:w="110" w:type="dxa"/>
+              <w:right w:w="110" w:type="dxa"/>
+            </w:tcMar>
+          </w:tcPr>
+          <w:p>
+            <w:r>
+              <w:rPr>
+                <w:rFonts w:ascii="PingFang TC" w:hAnsi="PingFang TC"/>
+                <w:color w:val="2D3748"/>
+                <w:sz w:val="19"/>
+              </w:rPr>
+              <w:t>清查雙方現存婚後財產扣除負債後差額平均分配。五十年婚姻積累之房地產與存款，母親依法享有差額 50% 請求權。</w:t>
+            </w:r>
+          </w:p>
+        </w:tc>
+        <w:tc>
+          <w:tcPr>
+            <w:tcW w:type="dxa" w:w="2353"/>
+            <w:shd w:fill="FFFFFF"/>
+            <w:tcMar>
+              <w:top w:w="90" w:type="dxa"/>
+              <w:bottom w:w="90" w:type="dxa"/>
+              <w:left w:w="110" w:type="dxa"/>
+              <w:right w:w="110" w:type="dxa"/>
+            </w:tcMar>
+          </w:tcPr>
+          <w:p>
+            <w:r>
+              <w:rPr>
+                <w:rFonts w:ascii="PingFang TC" w:hAnsi="PingFang TC"/>
+                <w:b/>
+                <w:color w:val="A83212"/>
+                <w:sz w:val="19"/>
+              </w:rPr>
+              <w:t>【金額最大宗・佔90%以上】</w:t>
+              <w:br/>
+              <w:t>數百萬至數千萬元法定產權，為母親晚年生活最堅實保障。</w:t>
             </w:r>
           </w:p>
         </w:tc>
@@ -522,42 +703,287 @@
       <w:tr>
         <w:tc>
           <w:tcPr>
-            <w:tcW w:type="dxa" w:w="4706"/>
+            <w:tcW w:type="dxa" w:w="2353"/>
             <w:shd w:fill="FFFDF7"/>
             <w:tcMar>
               <w:top w:w="90" w:type="dxa"/>
               <w:bottom w:w="90" w:type="dxa"/>
-              <w:left w:w="120" w:type="dxa"/>
-              <w:right w:w="120" w:type="dxa"/>
+              <w:left w:w="110" w:type="dxa"/>
+              <w:right w:w="110" w:type="dxa"/>
             </w:tcMar>
           </w:tcPr>
           <w:p>
             <w:r>
               <w:rPr>
+                <w:rFonts w:ascii="PingFang TC" w:hAnsi="PingFang TC"/>
                 <w:b/>
-                <w:color w:val="D97706"/>
+                <w:color w:val="DE5814"/>
+                <w:sz w:val="19"/>
               </w:rPr>
-              <w:t>生活全無自理需全天照護</w:t>
+              <w:t>二、追討第三者條款（追加計算）</w:t>
             </w:r>
           </w:p>
         </w:tc>
         <w:tc>
           <w:tcPr>
-            <w:tcW w:type="dxa" w:w="4706"/>
+            <w:tcW w:type="dxa" w:w="2353"/>
             <w:shd w:fill="FFFDF7"/>
             <w:tcMar>
               <w:top w:w="90" w:type="dxa"/>
               <w:bottom w:w="90" w:type="dxa"/>
-              <w:left w:w="120" w:type="dxa"/>
-              <w:right w:w="120" w:type="dxa"/>
+              <w:left w:w="110" w:type="dxa"/>
+              <w:right w:w="110" w:type="dxa"/>
             </w:tcMar>
           </w:tcPr>
           <w:p>
             <w:r>
               <w:rPr>
+                <w:rFonts w:ascii="PingFang TC" w:hAnsi="PingFang TC"/>
                 <w:color w:val="2D3748"/>
+                <w:sz w:val="19"/>
               </w:rPr>
-              <w:t>載明「日常生活無自理能力，需24小時專人全天候監護照顧」。日後向父親索求每月扶養費、看護費與高額贍養費之鐵證。</w:t>
+              <w:t>民法第 1030 條之 3</w:t>
+              <w:br/>
+              <w:t>民法第 1020 條之 1</w:t>
+            </w:r>
+          </w:p>
+        </w:tc>
+        <w:tc>
+          <w:tcPr>
+            <w:tcW w:type="dxa" w:w="2353"/>
+            <w:shd w:fill="FFFDF7"/>
+            <w:tcMar>
+              <w:top w:w="90" w:type="dxa"/>
+              <w:bottom w:w="90" w:type="dxa"/>
+              <w:left w:w="110" w:type="dxa"/>
+              <w:right w:w="110" w:type="dxa"/>
+            </w:tcMar>
+          </w:tcPr>
+          <w:p>
+            <w:r>
+              <w:rPr>
+                <w:rFonts w:ascii="PingFang TC" w:hAnsi="PingFang TC"/>
+                <w:color w:val="2D3748"/>
+                <w:sz w:val="19"/>
+              </w:rPr>
+              <w:t>起訴前五年內，廖光輝為減少分配無償移轉予湛明輝之資產，全數追加計算為廖光輝現存財產！若不夠返還，法院直接判命「湛明輝代為吐出差額返還母親」！一年內贈與更得直接訴請撤銷。</w:t>
+            </w:r>
+          </w:p>
+        </w:tc>
+        <w:tc>
+          <w:tcPr>
+            <w:tcW w:type="dxa" w:w="2353"/>
+            <w:shd w:fill="FFFDF7"/>
+            <w:tcMar>
+              <w:top w:w="90" w:type="dxa"/>
+              <w:bottom w:w="90" w:type="dxa"/>
+              <w:left w:w="110" w:type="dxa"/>
+              <w:right w:w="110" w:type="dxa"/>
+            </w:tcMar>
+          </w:tcPr>
+          <w:p>
+            <w:r>
+              <w:rPr>
+                <w:rFonts w:ascii="PingFang TC" w:hAnsi="PingFang TC"/>
+                <w:b/>
+                <w:color w:val="A83212"/>
+                <w:sz w:val="19"/>
+              </w:rPr>
+              <w:t>【破解脫產殺手鐧】</w:t>
+              <w:br/>
+              <w:t>搬給湛明輝的現金房產全數追回計入，讓第三者白忙一場。</w:t>
+            </w:r>
+          </w:p>
+        </w:tc>
+      </w:tr>
+      <w:tr>
+        <w:tc>
+          <w:tcPr>
+            <w:tcW w:type="dxa" w:w="2353"/>
+            <w:shd w:fill="FFFFFF"/>
+            <w:tcMar>
+              <w:top w:w="90" w:type="dxa"/>
+              <w:bottom w:w="90" w:type="dxa"/>
+              <w:left w:w="110" w:type="dxa"/>
+              <w:right w:w="110" w:type="dxa"/>
+            </w:tcMar>
+          </w:tcPr>
+          <w:p>
+            <w:r>
+              <w:rPr>
+                <w:rFonts w:ascii="PingFang TC" w:hAnsi="PingFang TC"/>
+                <w:b/>
+                <w:color w:val="DE5814"/>
+                <w:sz w:val="19"/>
+              </w:rPr>
+              <w:t>三、侵害配偶權連帶精神撫慰金</w:t>
+            </w:r>
+          </w:p>
+        </w:tc>
+        <w:tc>
+          <w:tcPr>
+            <w:tcW w:type="dxa" w:w="2353"/>
+            <w:shd w:fill="FFFFFF"/>
+            <w:tcMar>
+              <w:top w:w="90" w:type="dxa"/>
+              <w:bottom w:w="90" w:type="dxa"/>
+              <w:left w:w="110" w:type="dxa"/>
+              <w:right w:w="110" w:type="dxa"/>
+            </w:tcMar>
+          </w:tcPr>
+          <w:p>
+            <w:r>
+              <w:rPr>
+                <w:rFonts w:ascii="PingFang TC" w:hAnsi="PingFang TC"/>
+                <w:color w:val="2D3748"/>
+                <w:sz w:val="19"/>
+              </w:rPr>
+              <w:t>民法第 184 條</w:t>
+              <w:br/>
+              <w:t>民法第 195 條第 3 項</w:t>
+            </w:r>
+          </w:p>
+        </w:tc>
+        <w:tc>
+          <w:tcPr>
+            <w:tcW w:type="dxa" w:w="2353"/>
+            <w:shd w:fill="FFFFFF"/>
+            <w:tcMar>
+              <w:top w:w="90" w:type="dxa"/>
+              <w:bottom w:w="90" w:type="dxa"/>
+              <w:left w:w="110" w:type="dxa"/>
+              <w:right w:w="110" w:type="dxa"/>
+            </w:tcMar>
+          </w:tcPr>
+          <w:p>
+            <w:r>
+              <w:rPr>
+                <w:rFonts w:ascii="PingFang TC" w:hAnsi="PingFang TC"/>
+                <w:color w:val="2D3748"/>
+                <w:sz w:val="19"/>
+              </w:rPr>
+              <w:t>共同提告廖光輝與湛明輝為連帶共同被告。舉證兩人同居出入、親暱對話。審酌母親八旬重病遭背叛之重大痛苦，判令兩人連帶賠償。</w:t>
+            </w:r>
+          </w:p>
+        </w:tc>
+        <w:tc>
+          <w:tcPr>
+            <w:tcW w:type="dxa" w:w="2353"/>
+            <w:shd w:fill="FFFFFF"/>
+            <w:tcMar>
+              <w:top w:w="90" w:type="dxa"/>
+              <w:bottom w:w="90" w:type="dxa"/>
+              <w:left w:w="110" w:type="dxa"/>
+              <w:right w:w="110" w:type="dxa"/>
+            </w:tcMar>
+          </w:tcPr>
+          <w:p>
+            <w:r>
+              <w:rPr>
+                <w:rFonts w:ascii="PingFang TC" w:hAnsi="PingFang TC"/>
+                <w:b/>
+                <w:color w:val="A83212"/>
+                <w:sz w:val="19"/>
+              </w:rPr>
+              <w:t>【直擊第三者連帶賠償】</w:t>
+              <w:br/>
+              <w:t>實務判賠金額普遍落於 60 萬 ～ 100 萬元。</w:t>
+            </w:r>
+          </w:p>
+        </w:tc>
+      </w:tr>
+      <w:tr>
+        <w:tc>
+          <w:tcPr>
+            <w:tcW w:type="dxa" w:w="2353"/>
+            <w:shd w:fill="FFFDF7"/>
+            <w:tcMar>
+              <w:top w:w="90" w:type="dxa"/>
+              <w:bottom w:w="90" w:type="dxa"/>
+              <w:left w:w="110" w:type="dxa"/>
+              <w:right w:w="110" w:type="dxa"/>
+            </w:tcMar>
+          </w:tcPr>
+          <w:p>
+            <w:r>
+              <w:rPr>
+                <w:rFonts w:ascii="PingFang TC" w:hAnsi="PingFang TC"/>
+                <w:b/>
+                <w:color w:val="DE5814"/>
+                <w:sz w:val="19"/>
+              </w:rPr>
+              <w:t>四、離婚損害賠償與終身贍養費</w:t>
+            </w:r>
+          </w:p>
+        </w:tc>
+        <w:tc>
+          <w:tcPr>
+            <w:tcW w:type="dxa" w:w="2353"/>
+            <w:shd w:fill="FFFDF7"/>
+            <w:tcMar>
+              <w:top w:w="90" w:type="dxa"/>
+              <w:bottom w:w="90" w:type="dxa"/>
+              <w:left w:w="110" w:type="dxa"/>
+              <w:right w:w="110" w:type="dxa"/>
+            </w:tcMar>
+          </w:tcPr>
+          <w:p>
+            <w:r>
+              <w:rPr>
+                <w:rFonts w:ascii="PingFang TC" w:hAnsi="PingFang TC"/>
+                <w:color w:val="2D3748"/>
+                <w:sz w:val="19"/>
+              </w:rPr>
+              <w:t>民法第 1056 條</w:t>
+              <w:br/>
+              <w:t>民法第 1057 條</w:t>
+            </w:r>
+          </w:p>
+        </w:tc>
+        <w:tc>
+          <w:tcPr>
+            <w:tcW w:type="dxa" w:w="2353"/>
+            <w:shd w:fill="FFFDF7"/>
+            <w:tcMar>
+              <w:top w:w="90" w:type="dxa"/>
+              <w:bottom w:w="90" w:type="dxa"/>
+              <w:left w:w="110" w:type="dxa"/>
+              <w:right w:w="110" w:type="dxa"/>
+            </w:tcMar>
+          </w:tcPr>
+          <w:p>
+            <w:r>
+              <w:rPr>
+                <w:rFonts w:ascii="PingFang TC" w:hAnsi="PingFang TC"/>
+                <w:color w:val="2D3748"/>
+                <w:sz w:val="19"/>
+              </w:rPr>
+              <w:t>判決離婚非財產損害賠償（20萬~80萬）；加計母親八旬失智、無謀生能力，判命廖光輝按月全額給付外籍看護薪資（約3.5萬）與終身照護費，或一次性提撥數百萬贍養基金。</w:t>
+            </w:r>
+          </w:p>
+        </w:tc>
+        <w:tc>
+          <w:tcPr>
+            <w:tcW w:type="dxa" w:w="2353"/>
+            <w:shd w:fill="FFFDF7"/>
+            <w:tcMar>
+              <w:top w:w="90" w:type="dxa"/>
+              <w:bottom w:w="90" w:type="dxa"/>
+              <w:left w:w="110" w:type="dxa"/>
+              <w:right w:w="110" w:type="dxa"/>
+            </w:tcMar>
+          </w:tcPr>
+          <w:p>
+            <w:r>
+              <w:rPr>
+                <w:rFonts w:ascii="PingFang TC" w:hAnsi="PingFang TC"/>
+                <w:b/>
+                <w:color w:val="A83212"/>
+                <w:sz w:val="19"/>
+              </w:rPr>
+              <w:t>【終身全額保障尊嚴】</w:t>
+              <w:br/>
+              <w:t>外籍看護月薪與安養醫療費由男方全額埋單。</w:t>
             </w:r>
           </w:p>
         </w:tc>
@@ -574,7 +1000,7 @@
           <w:color w:val="DE5814"/>
           <w:sz w:val="32"/>
         </w:rPr>
-        <w:t>第二章：緊急法律止血與防禦程序（第一時間阻斷脫產）</w:t>
+        <w:t>肆、【步驟篇】家屬即刻行動 6 大實施步驟（SOP）</w:t>
       </w:r>
     </w:p>
     <w:p>
@@ -588,7 +1014,7 @@
           <w:color w:val="A83212"/>
           <w:sz w:val="26"/>
         </w:rPr>
-        <w:t>2.1 第一要務：立刻向家事法院聲請「監護宣告」</w:t>
+        <w:t>步驟 1：前往戶籍地區公所領取【身心障礙鑑定表】</w:t>
       </w:r>
     </w:p>
     <w:p>
@@ -602,25 +1028,21 @@
           <w:color w:val="2D3748"/>
           <w:sz w:val="21"/>
         </w:rPr>
-        <w:t xml:space="preserve">• </w:t>
+        <w:t>攜帶證件：母親身分證正本、印章、1吋照片3張、代辦人身分證與印章。先領取空白表格，以利看診當天在台中榮總同步完成醫療鑑定，免除多跑一趟公所。</w:t>
       </w:r>
+    </w:p>
+    <w:p>
+      <w:pPr>
+        <w:spacing w:before="200" w:after="80"/>
+      </w:pPr>
       <w:r>
         <w:rPr>
           <w:rFonts w:ascii="PingFang TC" w:hAnsi="PingFang TC"/>
           <w:b/>
-          <w:color w:val="D97706"/>
-          <w:sz w:val="21"/>
+          <w:color w:val="A83212"/>
+          <w:sz w:val="26"/>
         </w:rPr>
-        <w:t>法律依據：</w:t>
-      </w:r>
-      <w:r>
-        <w:rPr>
-          <w:rFonts w:ascii="PingFang TC" w:hAnsi="PingFang TC"/>
-          <w:b w:val="0"/>
-          <w:color w:val="2D3748"/>
-          <w:sz w:val="21"/>
-        </w:rPr>
-        <w:t>民法第 14 條及家事事件法規定。母親因神經退化失智已無法為有效之意思表示。</w:t>
+        <w:t>步驟 2：台中榮總神經內科就醫開立「精準專業診斷書」</w:t>
       </w:r>
     </w:p>
     <w:p>
@@ -634,7 +1056,100 @@
           <w:color w:val="2D3748"/>
           <w:sz w:val="21"/>
         </w:rPr>
-        <w:t xml:space="preserve">• </w:t>
+        <w:t>依律師指示，請醫師在【乙種診斷證明書】中具體載明以下專業神經醫學術語與法定關鍵字：</w:t>
+      </w:r>
+    </w:p>
+    <w:p>
+      <w:pPr>
+        <w:spacing w:before="40" w:after="80" w:line="300" w:lineRule="auto"/>
+      </w:pPr>
+      <w:r>
+        <w:rPr>
+          <w:rFonts w:ascii="PingFang TC" w:hAnsi="PingFang TC"/>
+          <w:b w:val="0"/>
+          <w:color w:val="2D3748"/>
+          <w:sz w:val="21"/>
+        </w:rPr>
+        <w:t>1. 精確病名：載明「阿茲海默型失智症／進行性腦神經退化症」伴隨「嚴重認知功能障礙（Severe Cognitive Impairment）」。</w:t>
+      </w:r>
+    </w:p>
+    <w:p>
+      <w:pPr>
+        <w:spacing w:before="40" w:after="80" w:line="300" w:lineRule="auto"/>
+      </w:pPr>
+      <w:r>
+        <w:rPr>
+          <w:rFonts w:ascii="PingFang TC" w:hAnsi="PingFang TC"/>
+          <w:b w:val="0"/>
+          <w:color w:val="2D3748"/>
+          <w:sz w:val="21"/>
+        </w:rPr>
+        <w:t>2. 記憶力與定向感：載明「近期與遠期記憶力顯著缺損，無法回憶重大生活與金錢事件」、「人、時、地定向感顯著喪失（Disorientation）」。</w:t>
+      </w:r>
+    </w:p>
+    <w:p>
+      <w:pPr>
+        <w:spacing w:before="40" w:after="80" w:line="300" w:lineRule="auto"/>
+      </w:pPr>
+      <w:r>
+        <w:rPr>
+          <w:rFonts w:ascii="PingFang TC" w:hAnsi="PingFang TC"/>
+          <w:b w:val="0"/>
+          <w:color w:val="2D3748"/>
+          <w:sz w:val="21"/>
+        </w:rPr>
+        <w:t>3. 智力與判斷力：載明「抽象思考、計算能力與判斷力嚴重衰退」。</w:t>
+      </w:r>
+    </w:p>
+    <w:p>
+      <w:pPr>
+        <w:spacing w:before="40" w:after="80" w:line="300" w:lineRule="auto"/>
+      </w:pPr>
+      <w:r>
+        <w:rPr>
+          <w:rFonts w:ascii="PingFang TC" w:hAnsi="PingFang TC"/>
+          <w:b w:val="0"/>
+          <w:color w:val="2D3748"/>
+          <w:sz w:val="21"/>
+        </w:rPr>
+        <w:t>4. 客觀量表指標：務必列出「臨床失智評估量表（CDR）＝ 1分以上」及 MMSE 測驗分數。</w:t>
+      </w:r>
+    </w:p>
+    <w:p>
+      <w:pPr>
+        <w:spacing w:before="40" w:after="80" w:line="300" w:lineRule="auto"/>
+      </w:pPr>
+      <w:r>
+        <w:rPr>
+          <w:rFonts w:ascii="PingFang TC" w:hAnsi="PingFang TC"/>
+          <w:b w:val="0"/>
+          <w:color w:val="2D3748"/>
+          <w:sz w:val="21"/>
+        </w:rPr>
+        <w:t>5. 生活自理能力：載明「日常生活活動能力完全喪失，需專人24小時全天候看護照料」。</w:t>
+      </w:r>
+    </w:p>
+    <w:p>
+      <w:pPr>
+        <w:spacing w:before="40" w:after="80" w:line="300" w:lineRule="auto"/>
+      </w:pPr>
+      <w:r>
+        <w:rPr>
+          <w:rFonts w:ascii="PingFang TC" w:hAnsi="PingFang TC"/>
+          <w:b/>
+          <w:color w:val="D97706"/>
+          <w:sz w:val="21"/>
+        </w:rPr>
+        <w:t>6. ★ 法院定錨關鍵字（最重要的一句話）：</w:t>
+      </w:r>
+      <w:r>
+        <w:rPr>
+          <w:rFonts w:ascii="PingFang TC" w:hAnsi="PingFang TC"/>
+          <w:b w:val="0"/>
+          <w:color w:val="2D3748"/>
+          <w:sz w:val="21"/>
+        </w:rPr>
+        <w:t>請醫師於醫囑載明：「病人因腦神經退化致心智缺陷與精神障礙，</w:t>
       </w:r>
       <w:r>
         <w:rPr>
@@ -643,7 +1158,7 @@
           <w:color w:val="D97706"/>
           <w:sz w:val="21"/>
         </w:rPr>
-        <w:t>作戰效果：</w:t>
+        <w:t>致不能為意思表示或受意思表示，已無獨立處理自己事務之能力</w:t>
       </w:r>
       <w:r>
         <w:rPr>
@@ -652,17 +1167,13 @@
           <w:color w:val="2D3748"/>
           <w:sz w:val="21"/>
         </w:rPr>
-        <w:t>由子女（您）出任法定監護人兼法定代理人。裁定後，母親名下財產受法院嚴格監護，</w:t>
+        <w:t>。」（民法第14條監護宣告法定要件）。</w:t>
       </w:r>
-      <w:r>
-        <w:rPr>
-          <w:rFonts w:ascii="PingFang TC" w:hAnsi="PingFang TC"/>
-          <w:b/>
-          <w:color w:val="D97706"/>
-          <w:sz w:val="21"/>
-        </w:rPr>
-        <w:t>父親無法私下誘導母親辦理協議離婚或將房地產贈與他人</w:t>
-      </w:r>
+    </w:p>
+    <w:p>
+      <w:pPr>
+        <w:spacing w:before="40" w:after="80" w:line="300" w:lineRule="auto"/>
+      </w:pPr>
       <w:r>
         <w:rPr>
           <w:rFonts w:ascii="PingFang TC" w:hAnsi="PingFang TC"/>
@@ -670,7 +1181,7 @@
           <w:color w:val="2D3748"/>
           <w:sz w:val="21"/>
         </w:rPr>
-        <w:t>；在未來所有民事與家事訴訟中，均由監護人代表母親出庭應訊，確保權益滴水不漏。</w:t>
+        <w:t>★ 同步於台中榮總第一醫療大樓一樓身障窗口遞交身障鑑定表，院方專人送衛生局審核發證。</w:t>
       </w:r>
     </w:p>
     <w:p>
@@ -684,7 +1195,7 @@
           <w:color w:val="A83212"/>
           <w:sz w:val="26"/>
         </w:rPr>
-        <w:t>2.2 全面清查父親底牌：向國稅局調閱財產總歸戶清單</w:t>
+        <w:t>步驟 3：地政事務所與國稅局「調證查底牌」</w:t>
       </w:r>
     </w:p>
     <w:p>
@@ -698,7 +1209,7 @@
           <w:color w:val="2D3748"/>
           <w:sz w:val="21"/>
         </w:rPr>
-        <w:t>持監護人身分或受任代理文件，前往國稅局申請父親與母親雙方之「全國財產稅總歸戶財產查詢清單」與「近三年綜合所得稅各類所得清單」。</w:t>
+        <w:t>1. 地政異動索引：至地政事務所申請廖光輝過去持有房產的「地籍異動索引」，查明房產在何時、以何原因過戶登記給湛明輝（脫產鐵證）。</w:t>
       </w:r>
     </w:p>
     <w:p>
@@ -712,7 +1223,21 @@
           <w:color w:val="2D3748"/>
           <w:sz w:val="21"/>
         </w:rPr>
-        <w:t>清查重點包括：所有不動產地號建號、上市櫃股票集保庫存、銀行大額存款利息來源帳戶。此舉能立即鎖定父親現存之總資產基數，作為剩餘財產分配請求權之計算基準。</w:t>
+        <w:t>2. 國稅局總歸戶與所得清單：調閱廖光輝名下之「全國財產稅總歸戶清單」與「近三年綜合所得稅各類所得清單」（從利息所得反推巨額定存帳戶，從股利反推股票庫存）。</w:t>
+      </w:r>
+    </w:p>
+    <w:p>
+      <w:pPr>
+        <w:spacing w:before="40" w:after="80" w:line="300" w:lineRule="auto"/>
+      </w:pPr>
+      <w:r>
+        <w:rPr>
+          <w:rFonts w:ascii="PingFang TC" w:hAnsi="PingFang TC"/>
+          <w:b w:val="0"/>
+          <w:color w:val="2D3748"/>
+          <w:sz w:val="21"/>
+        </w:rPr>
+        <w:t>3. 近五年贈與稅清單：查明廖光輝過去五年是否有申報贈與給湛明輝之紀錄；若私下轉帳未申報，可作為法院調查資金流向之重要線索。</w:t>
       </w:r>
     </w:p>
     <w:p>
@@ -726,7 +1251,7 @@
           <w:color w:val="A83212"/>
           <w:sz w:val="26"/>
         </w:rPr>
-        <w:t>2.3 聲請「假扣押／家事暫時處分」凍結名下資產</w:t>
+        <w:t>步驟 4：向家事法院具狀聲請【監護宣告】</w:t>
       </w:r>
     </w:p>
     <w:p>
@@ -740,39 +1265,7 @@
           <w:color w:val="2D3748"/>
           <w:sz w:val="21"/>
         </w:rPr>
-        <w:t>外遇方最常見的脫法行為即為私下出售房屋、解約定存或無償贈與第三者。律師應以侵害配偶權賠償金、剩餘財產分配為由，向法院聲請裁定對父親名下不動產與主要帳戶進行</w:t>
-      </w:r>
-      <w:r>
-        <w:rPr>
-          <w:rFonts w:ascii="PingFang TC" w:hAnsi="PingFang TC"/>
-          <w:b/>
-          <w:color w:val="D97706"/>
-          <w:sz w:val="21"/>
-        </w:rPr>
-        <w:t>暫時處分或假扣押查封</w:t>
-      </w:r>
-      <w:r>
-        <w:rPr>
-          <w:rFonts w:ascii="PingFang TC" w:hAnsi="PingFang TC"/>
-          <w:b w:val="0"/>
-          <w:color w:val="2D3748"/>
-          <w:sz w:val="21"/>
-        </w:rPr>
-        <w:t>，防止資產於訴訟期間遭暗中搬空。</w:t>
-      </w:r>
-    </w:p>
-    <w:p>
-      <w:pPr>
-        <w:spacing w:before="280" w:after="80"/>
-      </w:pPr>
-      <w:r>
-        <w:rPr>
-          <w:rFonts w:ascii="PingFang TC" w:hAnsi="PingFang TC"/>
-          <w:b/>
-          <w:color w:val="DE5814"/>
-          <w:sz w:val="32"/>
-        </w:rPr>
-        <w:t>第三章：爭取母親權益與金錢賠償最大化（四大求償途徑）</w:t>
+        <w:t>檢附榮總診斷書與戶籍謄本，由子女向法院聲請對母親做監護宣告並由子女擔任法定代理人，依法全面掌控訴訟防線與資產管理。</w:t>
       </w:r>
     </w:p>
     <w:p>
@@ -786,7 +1279,7 @@
           <w:color w:val="A83212"/>
           <w:sz w:val="26"/>
         </w:rPr>
-        <w:t>3.1 夫妻剩餘財產分配請求權（民法第 1030 條之 1）——金額最大宗（佔比 90% 以上）</w:t>
+        <w:t>步驟 5：委請律師發動【假扣押】與【暫時處分】</w:t>
       </w:r>
     </w:p>
     <w:p>
@@ -800,25 +1293,7 @@
           <w:color w:val="2D3748"/>
           <w:sz w:val="21"/>
         </w:rPr>
-        <w:t>法定財產制關係消滅時，夫或妻現存之婚後財產扣除負債後，雙方差額應平均分配。以八十歲夫妻之婚後積累而言，父親名下之房產增值、退休金存款及股票均屬分配範圍。母親依法享有</w:t>
-      </w:r>
-      <w:r>
-        <w:rPr>
-          <w:rFonts w:ascii="PingFang TC" w:hAnsi="PingFang TC"/>
-          <w:b/>
-          <w:color w:val="D97706"/>
-          <w:sz w:val="21"/>
-        </w:rPr>
-        <w:t>差額之 50% 請求權</w:t>
-      </w:r>
-      <w:r>
-        <w:rPr>
-          <w:rFonts w:ascii="PingFang TC" w:hAnsi="PingFang TC"/>
-          <w:b w:val="0"/>
-          <w:color w:val="2D3748"/>
-          <w:sz w:val="21"/>
-        </w:rPr>
-        <w:t>，這是確保母親晚年高額經濟保障的最核心支柱。</w:t>
+        <w:t>對廖光輝與湛明輝名下已知不動產與存款聲請假扣押查封，禁止買賣、移轉或脫產；同步聲請暫時處分，命令廖光輝按月匯給外籍看護薪資與生活費。</w:t>
       </w:r>
     </w:p>
     <w:p>
@@ -832,7 +1307,7 @@
           <w:color w:val="A83212"/>
           <w:sz w:val="26"/>
         </w:rPr>
-        <w:t>3.2 致命殺手鐧：追討小三條款（民法第 1030 條之 3 追加計算）</w:t>
+        <w:t>步驟 6：實體訴訟反擊、共同求償與分產談判</w:t>
       </w:r>
     </w:p>
     <w:p>
@@ -846,520 +1321,7 @@
           <w:color w:val="2D3748"/>
           <w:sz w:val="21"/>
         </w:rPr>
-        <w:t>若父親在提出離婚前</w:t>
-      </w:r>
-      <w:r>
-        <w:rPr>
-          <w:rFonts w:ascii="PingFang TC" w:hAnsi="PingFang TC"/>
-          <w:b/>
-          <w:color w:val="D97706"/>
-          <w:sz w:val="21"/>
-        </w:rPr>
-        <w:t>五年內</w:t>
-      </w:r>
-      <w:r>
-        <w:rPr>
-          <w:rFonts w:ascii="PingFang TC" w:hAnsi="PingFang TC"/>
-          <w:b w:val="0"/>
-          <w:color w:val="2D3748"/>
-          <w:sz w:val="21"/>
-        </w:rPr>
-        <w:t>，企圖減少剩餘財產分配而將資產贈與小三（如購屋登記小三名下、大額資金無償匯款），法律明定</w:t>
-      </w:r>
-      <w:r>
-        <w:rPr>
-          <w:rFonts w:ascii="PingFang TC" w:hAnsi="PingFang TC"/>
-          <w:b/>
-          <w:color w:val="D97706"/>
-          <w:sz w:val="21"/>
-        </w:rPr>
-        <w:t>「應將該贈與財產全數追加計算，視為父親現存之婚後財產」</w:t>
-      </w:r>
-      <w:r>
-        <w:rPr>
-          <w:rFonts w:ascii="PingFang TC" w:hAnsi="PingFang TC"/>
-          <w:b w:val="0"/>
-          <w:color w:val="2D3748"/>
-          <w:sz w:val="21"/>
-        </w:rPr>
-        <w:t>！縱使父親名下故意脫產一空，法院仍會將贈與小三的金額加回計算，判令父親自現有資產或由小三承擔返還責任（民法第 1020-1 條撤銷權）。</w:t>
-      </w:r>
-    </w:p>
-    <w:p>
-      <w:pPr>
-        <w:spacing w:before="200" w:after="80"/>
-      </w:pPr>
-      <w:r>
-        <w:rPr>
-          <w:rFonts w:ascii="PingFang TC" w:hAnsi="PingFang TC"/>
-          <w:b/>
-          <w:color w:val="A83212"/>
-          <w:sz w:val="26"/>
-        </w:rPr>
-        <w:t>3.3 共同控告父親與小三「侵害配偶權」（民法第 184 條、第 195 條）</w:t>
-      </w:r>
-    </w:p>
-    <w:p>
-      <w:pPr>
-        <w:spacing w:before="40" w:after="80" w:line="300" w:lineRule="auto"/>
-      </w:pPr>
-      <w:r>
-        <w:rPr>
-          <w:rFonts w:ascii="PingFang TC" w:hAnsi="PingFang TC"/>
-          <w:b w:val="0"/>
-          <w:color w:val="2D3748"/>
-          <w:sz w:val="21"/>
-        </w:rPr>
-        <w:t>將小三與父親列為連帶共同被告。蒐集兩人同居進出、親密合照、牽手出遊、通訊對話等實質破壞婚姻生活之證據。法院審酌雙方資力及八旬原配病中遭背叛之重大精神痛苦，連帶精神慰撫金實務判賠金額普遍在</w:t>
-      </w:r>
-      <w:r>
-        <w:rPr>
-          <w:rFonts w:ascii="PingFang TC" w:hAnsi="PingFang TC"/>
-          <w:b/>
-          <w:color w:val="D97706"/>
-          <w:sz w:val="21"/>
-        </w:rPr>
-        <w:t>30 萬 ～ 100 萬元</w:t>
-      </w:r>
-      <w:r>
-        <w:rPr>
-          <w:rFonts w:ascii="PingFang TC" w:hAnsi="PingFang TC"/>
-          <w:b w:val="0"/>
-          <w:color w:val="2D3748"/>
-          <w:sz w:val="21"/>
-        </w:rPr>
-        <w:t>不等，由兩人負連帶清償責任。</w:t>
-      </w:r>
-    </w:p>
-    <w:p>
-      <w:pPr>
-        <w:spacing w:before="200" w:after="80"/>
-      </w:pPr>
-      <w:r>
-        <w:rPr>
-          <w:rFonts w:ascii="PingFang TC" w:hAnsi="PingFang TC"/>
-          <w:b/>
-          <w:color w:val="A83212"/>
-          <w:sz w:val="26"/>
-        </w:rPr>
-        <w:t>3.4 判決離婚損害賠償（民法第 1056 條）與終身贍養費（民法第 1057 條）</w:t>
-      </w:r>
-    </w:p>
-    <w:p>
-      <w:pPr>
-        <w:spacing w:before="40" w:after="80" w:line="300" w:lineRule="auto"/>
-      </w:pPr>
-      <w:r>
-        <w:rPr>
-          <w:rFonts w:ascii="PingFang TC" w:hAnsi="PingFang TC"/>
-          <w:b w:val="0"/>
-          <w:color w:val="2D3748"/>
-          <w:sz w:val="21"/>
-        </w:rPr>
-        <w:t>• 離婚過失賠償：因父親可歸責之事由致離婚，母親得請求單獨之精神損害賠償（30萬～80萬）。</w:t>
-      </w:r>
-    </w:p>
-    <w:p>
-      <w:pPr>
-        <w:spacing w:before="40" w:after="80" w:line="300" w:lineRule="auto"/>
-      </w:pPr>
-      <w:r>
-        <w:rPr>
-          <w:rFonts w:ascii="PingFang TC" w:hAnsi="PingFang TC"/>
-          <w:b w:val="0"/>
-          <w:color w:val="2D3748"/>
-          <w:sz w:val="21"/>
-        </w:rPr>
-        <w:t>• 終身照護贍養費：母親八旬失智、無自理與謀生能力，因判決離婚陷於重大照護困難。法院將審酌外籍看護月薪（約3.5萬）、醫療耗材、安養費用，判命父親按月給付高額生活扶養費或一次性支付大額贍養基金。</w:t>
-      </w:r>
-    </w:p>
-    <w:p>
-      <w:pPr>
-        <w:spacing w:before="280" w:after="80"/>
-      </w:pPr>
-      <w:r>
-        <w:rPr>
-          <w:rFonts w:ascii="PingFang TC" w:hAnsi="PingFang TC"/>
-          <w:b/>
-          <w:color w:val="DE5814"/>
-          <w:sz w:val="32"/>
-        </w:rPr>
-        <w:t>第四章：八旬長輩核心戰略抉擇——「離」與「不離」的極限博弈</w:t>
-      </w:r>
-    </w:p>
-    <w:p>
-      <w:pPr>
-        <w:spacing w:before="40" w:after="80" w:line="300" w:lineRule="auto"/>
-      </w:pPr>
-      <w:r>
-        <w:rPr>
-          <w:rFonts w:ascii="PingFang TC" w:hAnsi="PingFang TC"/>
-          <w:b w:val="0"/>
-          <w:color w:val="2D3748"/>
-          <w:sz w:val="21"/>
-        </w:rPr>
-        <w:t>雙方年逾八旬，在法律實戰中，「堅決不離婚」與「反訴離婚」各有極為顯著之戰略優劣，應視父親資產流動性與脫產風險精準抉擇：</w:t>
-      </w:r>
-    </w:p>
-    <w:tbl>
-      <w:tblPr>
-        <w:tblW w:type="auto" w:w="0"/>
-        <w:jc w:val="center"/>
-        <w:tblLook w:firstColumn="1" w:firstRow="1" w:lastColumn="0" w:lastRow="0" w:noHBand="0" w:noVBand="1" w:val="04A0"/>
-      </w:tblPr>
-      <w:tblGrid>
-        <w:gridCol w:w="3137"/>
-        <w:gridCol w:w="3137"/>
-        <w:gridCol w:w="3137"/>
-      </w:tblGrid>
-      <w:tr>
-        <w:tc>
-          <w:tcPr>
-            <w:tcW w:type="dxa" w:w="3137"/>
-            <w:shd w:fill="FEF3C7"/>
-            <w:tcMar>
-              <w:top w:w="100" w:type="dxa"/>
-              <w:bottom w:w="100" w:type="dxa"/>
-              <w:left w:w="120" w:type="dxa"/>
-              <w:right w:w="120" w:type="dxa"/>
-            </w:tcMar>
-          </w:tcPr>
-          <w:p>
-            <w:r>
-              <w:rPr>
-                <w:b/>
-                <w:color w:val="A83212"/>
-              </w:rPr>
-              <w:t>戰略方案</w:t>
-            </w:r>
-          </w:p>
-        </w:tc>
-        <w:tc>
-          <w:tcPr>
-            <w:tcW w:type="dxa" w:w="3137"/>
-            <w:shd w:fill="FEF3C7"/>
-            <w:tcMar>
-              <w:top w:w="100" w:type="dxa"/>
-              <w:bottom w:w="100" w:type="dxa"/>
-              <w:left w:w="120" w:type="dxa"/>
-              <w:right w:w="120" w:type="dxa"/>
-            </w:tcMar>
-          </w:tcPr>
-          <w:p>
-            <w:r>
-              <w:rPr>
-                <w:b/>
-                <w:color w:val="A83212"/>
-              </w:rPr>
-              <w:t>法律策略與操作重點</w:t>
-            </w:r>
-          </w:p>
-        </w:tc>
-        <w:tc>
-          <w:tcPr>
-            <w:tcW w:type="dxa" w:w="3137"/>
-            <w:shd w:fill="FEF3C7"/>
-            <w:tcMar>
-              <w:top w:w="100" w:type="dxa"/>
-              <w:bottom w:w="100" w:type="dxa"/>
-              <w:left w:w="120" w:type="dxa"/>
-              <w:right w:w="120" w:type="dxa"/>
-            </w:tcMar>
-          </w:tcPr>
-          <w:p>
-            <w:r>
-              <w:rPr>
-                <w:b/>
-                <w:color w:val="A83212"/>
-              </w:rPr>
-              <w:t>權益最大化效益評估</w:t>
-            </w:r>
-          </w:p>
-        </w:tc>
-      </w:tr>
-      <w:tr>
-        <w:tc>
-          <w:tcPr>
-            <w:tcW w:type="dxa" w:w="3137"/>
-            <w:shd w:fill="FFFFFF"/>
-            <w:tcMar>
-              <w:top w:w="100" w:type="dxa"/>
-              <w:bottom w:w="100" w:type="dxa"/>
-              <w:left w:w="120" w:type="dxa"/>
-              <w:right w:w="120" w:type="dxa"/>
-            </w:tcMar>
-          </w:tcPr>
-          <w:p>
-            <w:r>
-              <w:rPr>
-                <w:rFonts w:ascii="PingFang TC" w:hAnsi="PingFang TC"/>
-                <w:b/>
-                <w:color w:val="DE5814"/>
-                <w:sz w:val="19"/>
-              </w:rPr>
-              <w:t>策略 A：堅決不離</w:t>
-              <w:br/>
-              <w:t>（以拖待變・遺產保全）</w:t>
-            </w:r>
-          </w:p>
-        </w:tc>
-        <w:tc>
-          <w:tcPr>
-            <w:tcW w:type="dxa" w:w="3137"/>
-            <w:shd w:fill="FFFFFF"/>
-            <w:tcMar>
-              <w:top w:w="100" w:type="dxa"/>
-              <w:bottom w:w="100" w:type="dxa"/>
-              <w:left w:w="120" w:type="dxa"/>
-              <w:right w:w="120" w:type="dxa"/>
-            </w:tcMar>
-          </w:tcPr>
-          <w:p>
-            <w:r>
-              <w:rPr>
-                <w:rFonts w:ascii="PingFang TC" w:hAnsi="PingFang TC"/>
-                <w:color w:val="2D3748"/>
-                <w:sz w:val="19"/>
-              </w:rPr>
-              <w:t>1. 依民法第 1052 條第 2 項但書，外遇有過失方無權強逼無過失重病原配離婚。</w:t>
-              <w:br/>
-              <w:t>2. 向法院聲請裁定「給付家庭生活費暫時處分」，強制父親每月按時匯入外勞看護費與生活開銷。</w:t>
-              <w:br/>
-              <w:t>3. 保全通姦證據，單獨訴請父親與小三賠償侵害配偶權。</w:t>
-            </w:r>
-          </w:p>
-        </w:tc>
-        <w:tc>
-          <w:tcPr>
-            <w:tcW w:type="dxa" w:w="3137"/>
-            <w:shd w:fill="FFFFFF"/>
-            <w:tcMar>
-              <w:top w:w="100" w:type="dxa"/>
-              <w:bottom w:w="100" w:type="dxa"/>
-              <w:left w:w="120" w:type="dxa"/>
-              <w:right w:w="120" w:type="dxa"/>
-            </w:tcMar>
-          </w:tcPr>
-          <w:p>
-            <w:r>
-              <w:rPr>
-                <w:rFonts w:ascii="PingFang TC" w:hAnsi="PingFang TC"/>
-                <w:color w:val="A83212"/>
-                <w:sz w:val="19"/>
-              </w:rPr>
-              <w:t>【終極最大利益】</w:t>
-              <w:br/>
-              <w:t>母親完整保留合法配偶之第一順位法定繼承權！</w:t>
-              <w:br/>
-              <w:t>日後父親百年之時，母親可先主張「夫妻剩餘財產分一半」，再與全體子女均分剩餘遺產。小三在法律上為局外人，一毛遺產皆無權繼承！</w:t>
-            </w:r>
-          </w:p>
-        </w:tc>
-      </w:tr>
-      <w:tr>
-        <w:tc>
-          <w:tcPr>
-            <w:tcW w:type="dxa" w:w="3137"/>
-            <w:shd w:fill="FFFDF7"/>
-            <w:tcMar>
-              <w:top w:w="100" w:type="dxa"/>
-              <w:bottom w:w="100" w:type="dxa"/>
-              <w:left w:w="120" w:type="dxa"/>
-              <w:right w:w="120" w:type="dxa"/>
-            </w:tcMar>
-          </w:tcPr>
-          <w:p>
-            <w:r>
-              <w:rPr>
-                <w:rFonts w:ascii="PingFang TC" w:hAnsi="PingFang TC"/>
-                <w:b/>
-                <w:color w:val="DE5814"/>
-                <w:sz w:val="19"/>
-              </w:rPr>
-              <w:t>策略 B：同意／反訴離婚</w:t>
-              <w:br/>
-              <w:t>（即刻落袋・強制清算）</w:t>
-            </w:r>
-          </w:p>
-        </w:tc>
-        <w:tc>
-          <w:tcPr>
-            <w:tcW w:type="dxa" w:w="3137"/>
-            <w:shd w:fill="FFFDF7"/>
-            <w:tcMar>
-              <w:top w:w="100" w:type="dxa"/>
-              <w:bottom w:w="100" w:type="dxa"/>
-              <w:left w:w="120" w:type="dxa"/>
-              <w:right w:w="120" w:type="dxa"/>
-            </w:tcMar>
-          </w:tcPr>
-          <w:p>
-            <w:r>
-              <w:rPr>
-                <w:rFonts w:ascii="PingFang TC" w:hAnsi="PingFang TC"/>
-                <w:color w:val="2D3748"/>
-                <w:sz w:val="19"/>
-              </w:rPr>
-              <w:t>1. 發現父親正在加速轉賣不動產、洗錢移轉資產給小三，拖延恐遭完全脫產。</w:t>
-              <w:br/>
-              <w:t>2. 即刻發動反訴，全面聲請假扣押凍結所有已知房產與存款。</w:t>
-              <w:br/>
-              <w:t>3. 主張剩餘財產差額半數＋民法1030-3追討追加＋高額贍養費＋精神慰撫金。</w:t>
-            </w:r>
-          </w:p>
-        </w:tc>
-        <w:tc>
-          <w:tcPr>
-            <w:tcW w:type="dxa" w:w="3137"/>
-            <w:shd w:fill="FFFDF7"/>
-            <w:tcMar>
-              <w:top w:w="100" w:type="dxa"/>
-              <w:bottom w:w="100" w:type="dxa"/>
-              <w:left w:w="120" w:type="dxa"/>
-              <w:right w:w="120" w:type="dxa"/>
-            </w:tcMar>
-          </w:tcPr>
-          <w:p>
-            <w:r>
-              <w:rPr>
-                <w:rFonts w:ascii="PingFang TC" w:hAnsi="PingFang TC"/>
-                <w:color w:val="2D3748"/>
-                <w:sz w:val="19"/>
-              </w:rPr>
-              <w:t>【落袋為安・徹底切割】</w:t>
-              <w:br/>
-              <w:t>透過法院強制執行程序，直接將數千萬之現金存款與房屋產權登記回母親名下。</w:t>
-              <w:br/>
-              <w:t>由監護人（子女）設立安養照護專用安養信託，確保母親晚年尊嚴與醫療照料無虞。</w:t>
-            </w:r>
-          </w:p>
-        </w:tc>
-      </w:tr>
-    </w:tbl>
-    <w:p>
-      <w:pPr>
-        <w:spacing w:before="280" w:after="80"/>
-      </w:pPr>
-      <w:r>
-        <w:rPr>
-          <w:rFonts w:ascii="PingFang TC" w:hAnsi="PingFang TC"/>
-          <w:b/>
-          <w:color w:val="DE5814"/>
-          <w:sz w:val="32"/>
-        </w:rPr>
-        <w:t>第五章：訴訟作戰 SOP 推進甘特時程與家屬檢核表</w:t>
-      </w:r>
-    </w:p>
-    <w:p>
-      <w:pPr>
-        <w:spacing w:before="200" w:after="80"/>
-      </w:pPr>
-      <w:r>
-        <w:rPr>
-          <w:rFonts w:ascii="PingFang TC" w:hAnsi="PingFang TC"/>
-          <w:b/>
-          <w:color w:val="A83212"/>
-          <w:sz w:val="26"/>
-        </w:rPr>
-        <w:t>第一階段（D-Day ~ 2週內）：醫院與證明開立</w:t>
-      </w:r>
-    </w:p>
-    <w:p>
-      <w:pPr>
-        <w:spacing w:before="40" w:after="80" w:line="300" w:lineRule="auto"/>
-      </w:pPr>
-      <w:r>
-        <w:rPr>
-          <w:rFonts w:ascii="PingFang TC" w:hAnsi="PingFang TC"/>
-          <w:b w:val="0"/>
-          <w:color w:val="2D3748"/>
-          <w:sz w:val="21"/>
-        </w:rPr>
-        <w:t>帶母親至台中榮總神經內科就醫，同步開妥具備「失智CDR、完全喪失事理辨識、全天需專人照顧」之乙種診斷書，並於區公所領表後於院內完成身心障礙鑑定遞件。</w:t>
-      </w:r>
-    </w:p>
-    <w:p>
-      <w:pPr>
-        <w:spacing w:before="200" w:after="80"/>
-      </w:pPr>
-      <w:r>
-        <w:rPr>
-          <w:rFonts w:ascii="PingFang TC" w:hAnsi="PingFang TC"/>
-          <w:b/>
-          <w:color w:val="A83212"/>
-          <w:sz w:val="26"/>
-        </w:rPr>
-        <w:t>第二階段（D+15天 ~ 1個月）：監護宣告與財產清查</w:t>
-      </w:r>
-    </w:p>
-    <w:p>
-      <w:pPr>
-        <w:spacing w:before="40" w:after="80" w:line="300" w:lineRule="auto"/>
-      </w:pPr>
-      <w:r>
-        <w:rPr>
-          <w:rFonts w:ascii="PingFang TC" w:hAnsi="PingFang TC"/>
-          <w:b w:val="0"/>
-          <w:color w:val="2D3748"/>
-          <w:sz w:val="21"/>
-        </w:rPr>
-        <w:t>向家事法院送狀聲請對母親做「監護宣告」並指派子女為監護人；持證件前往國稅局調閱父母親雙方全國財產總歸戶清單與近三年綜所稅各類所得資料。</w:t>
-      </w:r>
-    </w:p>
-    <w:p>
-      <w:pPr>
-        <w:spacing w:before="200" w:after="80"/>
-      </w:pPr>
-      <w:r>
-        <w:rPr>
-          <w:rFonts w:ascii="PingFang TC" w:hAnsi="PingFang TC"/>
-          <w:b/>
-          <w:color w:val="A83212"/>
-          <w:sz w:val="26"/>
-        </w:rPr>
-        <w:t>第三階段（D+1個月 ~ 2個月）：資產凍結與暫時處分</w:t>
-      </w:r>
-    </w:p>
-    <w:p>
-      <w:pPr>
-        <w:spacing w:before="40" w:after="80" w:line="300" w:lineRule="auto"/>
-      </w:pPr>
-      <w:r>
-        <w:rPr>
-          <w:rFonts w:ascii="PingFang TC" w:hAnsi="PingFang TC"/>
-          <w:b w:val="0"/>
-          <w:color w:val="2D3748"/>
-          <w:sz w:val="21"/>
-        </w:rPr>
-        <w:t>由律師向法院聲請「夫妻財產保全處分／假扣押」，凍結父親名下不動產與主要定存；同步聲請「給付家庭生活費與外勞照護費之暫時處分」。</w:t>
-      </w:r>
-    </w:p>
-    <w:p>
-      <w:pPr>
-        <w:spacing w:before="200" w:after="80"/>
-      </w:pPr>
-      <w:r>
-        <w:rPr>
-          <w:rFonts w:ascii="PingFang TC" w:hAnsi="PingFang TC"/>
-          <w:b/>
-          <w:color w:val="A83212"/>
-          <w:sz w:val="26"/>
-        </w:rPr>
-        <w:t>第四階段（D+2個月 ~ 6個月）：實體訴訟攻防與談判</w:t>
-      </w:r>
-    </w:p>
-    <w:p>
-      <w:pPr>
-        <w:spacing w:before="40" w:after="80" w:line="300" w:lineRule="auto"/>
-      </w:pPr>
-      <w:r>
-        <w:rPr>
-          <w:rFonts w:ascii="PingFang TC" w:hAnsi="PingFang TC"/>
-          <w:b w:val="0"/>
-          <w:color w:val="2D3748"/>
-          <w:sz w:val="21"/>
-        </w:rPr>
-        <w:t>向父親與小三提出侵害配偶權損害賠償訴訟；在家事法庭上運用民法第1052條但書拒絕無理離婚，或反訴主張第1030條之1與第1030條之3追討資產並全面清算。</w:t>
+        <w:t>共同起訴廖光輝與湛明輝侵害配偶權（求償百萬）；在家事法庭開庭時，依選定戰略（策略A以拖待變保全繼承權，或策略B反訴全面清算並依民法1030-3追討湛明輝名下資產），爭取母親最大化之權益！</w:t>
       </w:r>
     </w:p>
     <w:sectPr>

</xml_diff>